<commit_message>
Add: Final submission PDF with GitHub repository name, link, and verified layout
</commit_message>
<xml_diff>
--- a/Unit_1_LAN_Mini_Project_Report.docx
+++ b/Unit_1_LAN_Mini_Project_Report.docx
@@ -114,6 +114,7 @@
       <w:tr>
         <w:trPr>
           <w:jc w:val="center"/>
+          <w:cantSplit/>
         </w:trPr>
         <w:tc>
           <w:tcPr>
@@ -167,6 +168,7 @@
       <w:tr>
         <w:trPr>
           <w:jc w:val="center"/>
+          <w:cantSplit/>
         </w:trPr>
         <w:tc>
           <w:tcPr>
@@ -220,6 +222,7 @@
       <w:tr>
         <w:trPr>
           <w:jc w:val="center"/>
+          <w:cantSplit/>
         </w:trPr>
         <w:tc>
           <w:tcPr>
@@ -273,6 +276,7 @@
       <w:tr>
         <w:trPr>
           <w:jc w:val="center"/>
+          <w:cantSplit/>
         </w:trPr>
         <w:tc>
           <w:tcPr>
@@ -326,6 +330,7 @@
       <w:tr>
         <w:trPr>
           <w:jc w:val="center"/>
+          <w:cantSplit/>
         </w:trPr>
         <w:tc>
           <w:tcPr>
@@ -373,6 +378,98 @@
               </w:rPr>
               <w:t>PC-to-PC and Cross-Switch Ping</w:t>
             </w:r>
+          </w:p>
+        </w:tc>
+      </w:tr>
+      <w:tr>
+        <w:trPr>
+          <w:cantSplit/>
+        </w:trPr>
+        <w:tc>
+          <w:tcPr>
+            <w:tcW w:type="dxa" w:w="5040"/>
+          </w:tcPr>
+          <w:p>
+            <w:pPr>
+              <w:spacing w:before="60" w:after="60" w:line="276" w:lineRule="auto"/>
+              <w:jc w:val="left"/>
+            </w:pPr>
+            <w:r/>
+            <w:r>
+              <w:rPr>
+                <w:rFonts w:ascii="Times New Roman" w:hAnsi="Times New Roman"/>
+                <w:b/>
+                <w:sz w:val="20"/>
+              </w:rPr>
+              <w:t>GitHub Repository</w:t>
+            </w:r>
+          </w:p>
+        </w:tc>
+        <w:tc>
+          <w:tcPr>
+            <w:tcW w:type="dxa" w:w="5040"/>
+          </w:tcPr>
+          <w:p>
+            <w:pPr>
+              <w:spacing w:before="60" w:after="60" w:line="276" w:lineRule="auto"/>
+              <w:jc w:val="left"/>
+            </w:pPr>
+            <w:r/>
+            <w:r>
+              <w:rPr>
+                <w:rFonts w:ascii="Times New Roman" w:hAnsi="Times New Roman"/>
+                <w:b w:val="0"/>
+                <w:sz w:val="20"/>
+              </w:rPr>
+              <w:t>Cisco-Packet-Tracer-LAN-Mini-Project</w:t>
+            </w:r>
+          </w:p>
+        </w:tc>
+      </w:tr>
+      <w:tr>
+        <w:trPr>
+          <w:cantSplit/>
+        </w:trPr>
+        <w:tc>
+          <w:tcPr>
+            <w:tcW w:type="dxa" w:w="5040"/>
+          </w:tcPr>
+          <w:p>
+            <w:pPr>
+              <w:spacing w:before="60" w:after="60" w:line="276" w:lineRule="auto"/>
+              <w:jc w:val="left"/>
+            </w:pPr>
+            <w:r/>
+            <w:r>
+              <w:rPr>
+                <w:rFonts w:ascii="Times New Roman" w:hAnsi="Times New Roman"/>
+                <w:b/>
+                <w:sz w:val="20"/>
+              </w:rPr>
+              <w:t>GitHub Link</w:t>
+            </w:r>
+          </w:p>
+        </w:tc>
+        <w:tc>
+          <w:tcPr>
+            <w:tcW w:type="dxa" w:w="5040"/>
+          </w:tcPr>
+          <w:p>
+            <w:pPr>
+              <w:spacing w:before="60" w:after="60"/>
+            </w:pPr>
+            <w:r/>
+            <w:hyperlink r:id="rId13">
+              <w:r>
+                <w:rPr>
+                  <w:rFonts w:ascii="Times New Roman" w:hAnsi="Times New Roman"/>
+                  <w:color w:val="0000FF"/>
+                  <w:u w:val="single"/>
+                  <w:sz w:val="19"/>
+                </w:rPr>
+                <w:t>https://github.com/ShubhamShinde148/Cisco-Packet-Tracer-LAN-Mini-Project</w:t>
+              </w:r>
+            </w:hyperlink>
           </w:p>
         </w:tc>
       </w:tr>
@@ -528,6 +625,7 @@
       <w:tr>
         <w:trPr>
           <w:jc w:val="center"/>
+          <w:cantSplit/>
         </w:trPr>
         <w:tc>
           <w:tcPr>
@@ -608,6 +706,7 @@
       <w:tr>
         <w:trPr>
           <w:jc w:val="center"/>
+          <w:cantSplit/>
         </w:trPr>
         <w:tc>
           <w:tcPr>
@@ -682,6 +781,7 @@
       <w:tr>
         <w:trPr>
           <w:jc w:val="center"/>
+          <w:cantSplit/>
         </w:trPr>
         <w:tc>
           <w:tcPr>
@@ -756,6 +856,7 @@
       <w:tr>
         <w:trPr>
           <w:jc w:val="center"/>
+          <w:cantSplit/>
         </w:trPr>
         <w:tc>
           <w:tcPr>
@@ -830,6 +931,7 @@
       <w:tr>
         <w:trPr>
           <w:jc w:val="center"/>
+          <w:cantSplit/>
         </w:trPr>
         <w:tc>
           <w:tcPr>
@@ -904,6 +1006,7 @@
       <w:tr>
         <w:trPr>
           <w:jc w:val="center"/>
+          <w:cantSplit/>
         </w:trPr>
         <w:tc>
           <w:tcPr>
@@ -1013,6 +1116,7 @@
     </w:p>
     <w:p>
       <w:pPr>
+        <w:keepNext/>
         <w:jc w:val="center"/>
         <w:rPr>
           <w:rFonts w:ascii="Times New Roman" w:hAnsi="Times New Roman" w:cs="Times New Roman"/>
@@ -1029,7 +1133,7 @@
         </w:rPr>
         <w:drawing>
           <wp:inline distT="0" distB="0" distL="0" distR="0" wp14:anchorId="6195A9DA" wp14:editId="1CEE4C16">
-            <wp:extent cx="6400800" cy="3402330"/>
+            <wp:extent cx="5120640" cy="2721864"/>
             <wp:effectExtent l="0" t="0" r="0" b="7620"/>
             <wp:docPr id="1045117208" name="Picture 1"/>
             <wp:cNvGraphicFramePr>
@@ -1119,6 +1223,7 @@
       <w:tr>
         <w:trPr>
           <w:jc w:val="center"/>
+          <w:cantSplit/>
         </w:trPr>
         <w:tc>
           <w:tcPr>
@@ -1249,6 +1354,7 @@
       <w:tr>
         <w:trPr>
           <w:jc w:val="center"/>
+          <w:cantSplit/>
         </w:trPr>
         <w:tc>
           <w:tcPr>
@@ -1369,6 +1475,7 @@
       <w:tr>
         <w:trPr>
           <w:jc w:val="center"/>
+          <w:cantSplit/>
         </w:trPr>
         <w:tc>
           <w:tcPr>
@@ -1489,6 +1596,7 @@
       <w:tr>
         <w:trPr>
           <w:jc w:val="center"/>
+          <w:cantSplit/>
         </w:trPr>
         <w:tc>
           <w:tcPr>
@@ -1609,6 +1717,7 @@
       <w:tr>
         <w:trPr>
           <w:jc w:val="center"/>
+          <w:cantSplit/>
         </w:trPr>
         <w:tc>
           <w:tcPr>
@@ -1729,6 +1838,7 @@
       <w:tr>
         <w:trPr>
           <w:jc w:val="center"/>
+          <w:cantSplit/>
         </w:trPr>
         <w:tc>
           <w:tcPr>
@@ -2163,6 +2273,7 @@
     </w:p>
     <w:p>
       <w:pPr>
+        <w:keepNext/>
         <w:jc w:val="center"/>
         <w:rPr>
           <w:rFonts w:ascii="Times New Roman" w:hAnsi="Times New Roman" w:cs="Times New Roman"/>
@@ -2180,7 +2291,7 @@
         <w:lastRenderedPageBreak/>
         <w:drawing>
           <wp:inline distT="0" distB="0" distL="0" distR="0" wp14:anchorId="372E407E" wp14:editId="046CEDAE">
-            <wp:extent cx="6035040" cy="6742706"/>
+            <wp:extent cx="3682940" cy="4114800"/>
             <wp:effectExtent l="0" t="0" r="0" b="0"/>
             <wp:docPr id="2" name="Picture 2"/>
             <wp:cNvGraphicFramePr>
@@ -2268,6 +2379,7 @@
       <w:tr>
         <w:trPr>
           <w:jc w:val="center"/>
+          <w:cantSplit/>
         </w:trPr>
         <w:tc>
           <w:tcPr>
@@ -2373,6 +2485,7 @@
       <w:tr>
         <w:trPr>
           <w:jc w:val="center"/>
+          <w:cantSplit/>
         </w:trPr>
         <w:tc>
           <w:tcPr>
@@ -2470,6 +2583,7 @@
       <w:tr>
         <w:trPr>
           <w:jc w:val="center"/>
+          <w:cantSplit/>
         </w:trPr>
         <w:tc>
           <w:tcPr>
@@ -2778,6 +2892,41 @@
         </w:rPr>
         <w:t xml:space="preserve"> Successful ping screenshot showing PC1 → PC3 and PC1 → PC4 with 0% packet loss</w:t>
       </w:r>
+    </w:p>
+    <w:p>
+      <w:pPr>
+        <w:pStyle w:val="ListBullet"/>
+        <w:rPr>
+          <w:rFonts w:ascii="Times New Roman" w:hAnsi="Times New Roman" w:cs="Times New Roman"/>
+          <w:sz w:val="32"/>
+          <w:szCs w:val="32"/>
+        </w:rPr>
+      </w:pPr>
+      <w:r>
+        <w:rPr>
+          <w:rFonts w:ascii="Segoe UI Symbol" w:hAnsi="Segoe UI Symbol"/>
+          <w:sz w:val="32"/>
+        </w:rPr>
+        <w:t>✓</w:t>
+      </w:r>
+      <w:r>
+        <w:rPr>
+          <w:rFonts w:ascii="Times New Roman" w:hAnsi="Times New Roman"/>
+          <w:sz w:val="32"/>
+        </w:rPr>
+        <w:t xml:space="preserve"> GitHub Repository: </w:t>
+      </w:r>
+      <w:hyperlink r:id="rId13">
+        <w:r>
+          <w:rPr>
+            <w:rFonts w:ascii="Times New Roman" w:hAnsi="Times New Roman"/>
+            <w:color w:val="0000FF"/>
+            <w:u w:val="single"/>
+            <w:sz w:val="28"/>
+          </w:rPr>
+          <w:t>https://github.com/ShubhamShinde148/Cisco-Packet-Tracer-LAN-Mini-Project</w:t>
+        </w:r>
+      </w:hyperlink>
     </w:p>
     <w:sectPr>
       <w:footerReference w:type="default" r:id="rId10"/>

</xml_diff>